<commit_message>
Finalize MATH1201 Unit 1: complete graph-based tasks and intro
- Task 1: domain/range = all reals, function but not one-to-one
  (horizontal line y=4 crosses the cubic 3 times) from provided graph
- Task 3: confirmed g(x)=5x (rate 5) and f(x)=x^2; slope CD=6 via
  points (2,4),(4,16); slope EF=5; non-constant vs constant rate
- Task 4: cosine wave; maxima A,C,E,G at y=1, minima B,D,F,H at y=-1;
  full increasing/decreasing intervals; local vs absolute extrema
- Class introduction finalized (Kenya, subject line added)
- Add GeoGebra Task 2 plotting guide
- Regenerate .docx with completed tasks (double-spaced TNR)
</commit_message>
<xml_diff>
--- a/MATH1201_College_Algebra/Unit1_Functions_I/Assignment/Unit1_Assignment_Activity.docx
+++ b/MATH1201_College_Algebra/Unit1_Functions_I/Assignment/Unit1_Assignment_Activity.docx
@@ -204,7 +204,7 @@
           <w:b w:val="0"/>
           <w:sz w:val="24"/>
         </w:rPr>
-        <w:t>(i) Domain and Range. The domain is the set of all x-values the graph covers, read from the leftmost to the rightmost x-value; use a square bracket for an included endpoint (solid dot) and a parenthesis for an excluded endpoint (open dot). The range is the set of all y-values, from the lowest to the highest the graph reaches, using the same bracket rules. Read the exact endpoints from the provided graph and state Domain = [x_min, x_max] and Range = [y_min, y_max].</w:t>
+        <w:t>The given graph is a smooth curve that rises from the bottom of the plane on the left, peaks near the point (0, 5), dips to a small valley near (2, 3), and then rises steeply upward off the top of the plane on the right. The arrows on both ends indicate the curve continues without bound.</w:t>
       </w:r>
     </w:p>
     <w:p>
@@ -218,7 +218,21 @@
           <w:b w:val="0"/>
           <w:sz w:val="24"/>
         </w:rPr>
-        <w:t>(ii) Function and one-to-one. By the vertical line test, if every vertical line meets the graph at most once, each input has exactly one output, so it is a function (Abramson, 2023). By the horizontal line test, if every horizontal line meets the graph at most once, it is one-to-one; if a horizontal line meets it more than once (as with a parabola), it is a function but not one-to-one. State the conclusion with the justification based on the shape shown.</w:t>
+        <w:t>(i) Domain and Range. The curve extends left and right without end (both ends carry arrows), so every x-value is covered: the domain is all real numbers, (-infinity, infinity). The curve falls to negative infinity on the lower left and rises to positive infinity on the upper right, passing through every height in between, so the range is also all real numbers, (-infinity, infinity).</w:t>
+      </w:r>
+    </w:p>
+    <w:p>
+      <w:pPr>
+        <w:spacing w:line="480" w:lineRule="auto"/>
+        <w:ind w:firstLine="0"/>
+      </w:pPr>
+      <w:r>
+        <w:rPr>
+          <w:rFonts w:ascii="Times New Roman" w:hAnsi="Times New Roman"/>
+          <w:b w:val="0"/>
+          <w:sz w:val="24"/>
+        </w:rPr>
+        <w:t>(ii) Function and one-to-one. Any vertical line touches the curve exactly once, so each input x gives exactly one output y; therefore the graph is a function (Abramson, 2023). However, because the curve rises, dips slightly between the peak near (0, 5) and the valley near (2, 3), then rises again, a horizontal line such as y = 4 crosses the curve three times. Since at least one horizontal line meets the graph more than once, the function is not one-to-one, so it has no inverse over its full domain (Abramson, 2023).</w:t>
       </w:r>
     </w:p>
     <w:p>
@@ -374,7 +388,7 @@
           <w:b w:val="0"/>
           <w:sz w:val="24"/>
         </w:rPr>
-        <w:t>(ii) Slopes of CD (on f) and EF (on g). Using slope = (y2 - y1)/(x2 - x1): for example, taking C = (1, 1) and D = (3, 9) on f gives slope CD = (9 - 1)/(3 - 1) = 4; taking E = (1, 5) and F = (3, 15) on g gives slope EF = (15 - 5)/(3 - 1) = 5. The slope of EF equals the line's constant rate, so any two points give 5, while the slope of CD is an average rate that changes with the chosen points, confirming f's non-constant rate. Replace these example points with the actual C, D, E, F read from the graph.</w:t>
+        <w:t>(ii) Slopes of CD (on f) and EF (on g). Using slope = (y2 - y1)/(x2 - x1): on the parabola f(x) = x squared, take C = (2, 4) and D = (4, 16), giving slope CD = (16 - 4)/(4 - 2) = 12/2 = 6. On the line g(x) = 5x, take E = (1, 5) and F = (3, 15), giving slope EF = (15 - 5)/(3 - 1) = 10/2 = 5. The slope of EF is 5, matching the line's constant rate, so any two points on g give the same value; animal g gains weight at a steady 5 tons per foot. The slope of CD is 6, but this is only the average rate between x = 2 and x = 4 (between x = 1 and x = 3 it would be 4), confirming the parabola's rate of change is not constant. Animal f gains weight increasingly quickly as its length grows, rising much faster than g for larger lengths.</w:t>
       </w:r>
     </w:p>
     <w:p>
@@ -403,7 +417,7 @@
           <w:b w:val="0"/>
           <w:sz w:val="24"/>
         </w:rPr>
-        <w:t>A local maximum is a point higher than all nearby points (a peak, where the graph rises then falls); a local minimum is lower than nearby points (a valley, where the graph falls then rises) (Abramson, 2023). These differ from the absolute maximum and minimum, which are the single highest and lowest values over the entire domain. A local extremum is best only in its neighborhood, whereas an absolute extremum is best overall; a graph may have several local extrema but at most one absolute max and one absolute min.</w:t>
+        <w:t>The graph is a smooth, repeating wave (a cosine-type curve) oscillating between a height of y = 1 at its peaks and y = -1 at its valleys. The labeled points are A(-11, 1), B(-8, -1), C(-5, 1), D(-2, -1), E(1.57, 1), F(4.71, -1), G(7.85, 1), and H(11, -1).</w:t>
       </w:r>
     </w:p>
     <w:p>
@@ -417,7 +431,21 @@
           <w:b w:val="0"/>
           <w:sz w:val="24"/>
         </w:rPr>
-        <w:t>For intervals, read the x-coordinates of the turning points from the graph. The function is increasing where the graph rises left to right (positive slope) and decreasing where it falls (negative slope). Report each interval by its endpoints, for example increasing on (A, B) and decreasing on (B, C). A local maximum occurs where the graph changes from increasing to decreasing, and a local minimum where it changes from decreasing to increasing. State each extremum's approximate coordinates as shown on the graph.</w:t>
+        <w:t>A local maximum is a point higher than all nearby points (a peak). Here the peaks A, C, E, and G are local maxima, each at y = 1. A local minimum is a point lower than all nearby points (a valley); here B, D, F, and H are local minima, each at y = -1 (Abramson, 2023). These differ from the absolute maximum and minimum, which are the single highest and lowest values over the entire domain. Because this curve repeats, every peak reaches the same height (1) and every valley the same depth (-1), so each peak ties for the absolute maximum and each valley ties for the absolute minimum. The distinction is that a local extremum need only be highest or lowest in its immediate neighborhood, while an absolute extremum is highest or lowest over the whole graph; a periodic function like this has infinitely many local extrema.</w:t>
+      </w:r>
+    </w:p>
+    <w:p>
+      <w:pPr>
+        <w:spacing w:line="480" w:lineRule="auto"/>
+        <w:ind w:firstLine="0"/>
+      </w:pPr>
+      <w:r>
+        <w:rPr>
+          <w:rFonts w:ascii="Times New Roman" w:hAnsi="Times New Roman"/>
+          <w:b w:val="0"/>
+          <w:sz w:val="24"/>
+        </w:rPr>
+        <w:t>Intervals (reading left to right between the labeled points): increasing on (B, C) = (-8, -5); decreasing on (C, D) = (-5, -2); increasing on (D, E) = (-2, 1.57); decreasing on (E, F) = (1.57, 4.71); increasing on (F, G) = (4.71, 7.85); decreasing on (G, H) = (7.85, 11). At every peak the graph changes from increasing to decreasing (a local maximum), and at every valley from decreasing to increasing (a local minimum). The pattern continues indefinitely because the function is periodic.</w:t>
       </w:r>
     </w:p>
     <w:p>

</xml_diff>

<commit_message>
MATH1201 Unit 1 assignment: instructor name + native Word Title style
- Add instructor Chibuike Agu to the title page
- Use built-in Word Title style for the document title and native
  Heading 1/Heading 2 styles for sections so Word's outline/Navigation
  pane recognizes them
</commit_message>
<xml_diff>
--- a/MATH1201_College_Algebra/Unit1_Functions_I/Assignment/Unit1_Assignment_Activity.docx
+++ b/MATH1201_College_Algebra/Unit1_Functions_I/Assignment/Unit1_Assignment_Activity.docx
@@ -56,15 +56,16 @@
     </w:p>
     <w:p>
       <w:pPr>
+        <w:pStyle w:val="Title"/>
         <w:spacing w:line="480" w:lineRule="auto"/>
-        <w:ind w:firstLine="0"/>
         <w:jc w:val="center"/>
       </w:pPr>
       <w:r>
         <w:rPr>
           <w:rFonts w:ascii="Times New Roman" w:hAnsi="Times New Roman"/>
           <w:b/>
-          <w:sz w:val="24"/>
+          <w:color w:val="000000"/>
+          <w:sz w:val="28"/>
         </w:rPr>
         <w:t>Written Assignment Unit 1: Functions - I</w:t>
       </w:r>
@@ -139,7 +140,7 @@
           <w:b w:val="0"/>
           <w:sz w:val="24"/>
         </w:rPr>
-        <w:t>Instructor: [Instructor Name]</w:t>
+        <w:t>Instructor: Chibuike Agu</w:t>
       </w:r>
     </w:p>
     <w:p>

</xml_diff>

<commit_message>
MATH1201 assignment: block-paragraph spacing + sync md/docx
- Add 12pt space after body paragraphs so block (flush-left) paragraphs
  are visually separated instead of blurring under double-spacing
- Keep title-page lines tight (no extra spacing)
- Remove stale Task 3 note from .md so it matches the .docx
</commit_message>
<xml_diff>
--- a/MATH1201_College_Algebra/Unit1_Functions_I/Assignment/Unit1_Assignment_Activity.docx
+++ b/MATH1201_College_Algebra/Unit1_Functions_I/Assignment/Unit1_Assignment_Activity.docx
@@ -4,7 +4,7 @@
   <w:body>
     <w:p>
       <w:pPr>
-        <w:spacing w:line="480" w:lineRule="auto"/>
+        <w:spacing w:line="480" w:lineRule="auto" w:after="0"/>
         <w:ind w:firstLine="0"/>
       </w:pPr>
       <w:r>
@@ -17,7 +17,7 @@
     </w:p>
     <w:p>
       <w:pPr>
-        <w:spacing w:line="480" w:lineRule="auto"/>
+        <w:spacing w:line="480" w:lineRule="auto" w:after="0"/>
         <w:ind w:firstLine="0"/>
       </w:pPr>
       <w:r>
@@ -30,7 +30,7 @@
     </w:p>
     <w:p>
       <w:pPr>
-        <w:spacing w:line="480" w:lineRule="auto"/>
+        <w:spacing w:line="480" w:lineRule="auto" w:after="0"/>
         <w:ind w:firstLine="0"/>
       </w:pPr>
       <w:r>
@@ -43,7 +43,7 @@
     </w:p>
     <w:p>
       <w:pPr>
-        <w:spacing w:line="480" w:lineRule="auto"/>
+        <w:spacing w:line="480" w:lineRule="auto" w:after="0"/>
         <w:ind w:firstLine="0"/>
       </w:pPr>
       <w:r>
@@ -72,7 +72,7 @@
     </w:p>
     <w:p>
       <w:pPr>
-        <w:spacing w:line="480" w:lineRule="auto"/>
+        <w:spacing w:line="480" w:lineRule="auto" w:after="0"/>
         <w:ind w:firstLine="0"/>
       </w:pPr>
       <w:r>
@@ -85,7 +85,7 @@
     </w:p>
     <w:p>
       <w:pPr>
-        <w:spacing w:line="480" w:lineRule="auto"/>
+        <w:spacing w:line="480" w:lineRule="auto" w:after="0"/>
         <w:ind w:firstLine="0"/>
         <w:jc w:val="center"/>
       </w:pPr>
@@ -100,7 +100,7 @@
     </w:p>
     <w:p>
       <w:pPr>
-        <w:spacing w:line="480" w:lineRule="auto"/>
+        <w:spacing w:line="480" w:lineRule="auto" w:after="0"/>
         <w:ind w:firstLine="0"/>
         <w:jc w:val="center"/>
       </w:pPr>
@@ -115,7 +115,7 @@
     </w:p>
     <w:p>
       <w:pPr>
-        <w:spacing w:line="480" w:lineRule="auto"/>
+        <w:spacing w:line="480" w:lineRule="auto" w:after="0"/>
         <w:ind w:firstLine="0"/>
         <w:jc w:val="center"/>
       </w:pPr>
@@ -130,7 +130,7 @@
     </w:p>
     <w:p>
       <w:pPr>
-        <w:spacing w:line="480" w:lineRule="auto"/>
+        <w:spacing w:line="480" w:lineRule="auto" w:after="0"/>
         <w:ind w:firstLine="0"/>
         <w:jc w:val="center"/>
       </w:pPr>
@@ -145,7 +145,7 @@
     </w:p>
     <w:p>
       <w:pPr>
-        <w:spacing w:line="480" w:lineRule="auto"/>
+        <w:spacing w:line="480" w:lineRule="auto" w:after="0"/>
         <w:ind w:firstLine="0"/>
         <w:jc w:val="center"/>
       </w:pPr>
@@ -196,7 +196,7 @@
     </w:p>
     <w:p>
       <w:pPr>
-        <w:spacing w:line="480" w:lineRule="auto"/>
+        <w:spacing w:line="480" w:lineRule="auto" w:after="240"/>
         <w:ind w:firstLine="0"/>
       </w:pPr>
       <w:r>
@@ -210,7 +210,7 @@
     </w:p>
     <w:p>
       <w:pPr>
-        <w:spacing w:line="480" w:lineRule="auto"/>
+        <w:spacing w:line="480" w:lineRule="auto" w:after="240"/>
         <w:ind w:firstLine="0"/>
       </w:pPr>
       <w:r>
@@ -224,7 +224,7 @@
     </w:p>
     <w:p>
       <w:pPr>
-        <w:spacing w:line="480" w:lineRule="auto"/>
+        <w:spacing w:line="480" w:lineRule="auto" w:after="240"/>
         <w:ind w:firstLine="0"/>
       </w:pPr>
       <w:r>
@@ -253,7 +253,7 @@
     </w:p>
     <w:p>
       <w:pPr>
-        <w:spacing w:line="480" w:lineRule="auto"/>
+        <w:spacing w:line="480" w:lineRule="auto" w:after="240"/>
         <w:ind w:firstLine="0"/>
       </w:pPr>
       <w:r>
@@ -281,7 +281,7 @@
     </w:p>
     <w:p>
       <w:pPr>
-        <w:spacing w:line="480" w:lineRule="auto"/>
+        <w:spacing w:line="480" w:lineRule="auto" w:after="240"/>
         <w:ind w:firstLine="0"/>
       </w:pPr>
       <w:r>
@@ -295,7 +295,7 @@
     </w:p>
     <w:p>
       <w:pPr>
-        <w:spacing w:line="480" w:lineRule="auto"/>
+        <w:spacing w:line="480" w:lineRule="auto" w:after="240"/>
         <w:ind w:firstLine="0"/>
       </w:pPr>
       <w:r>
@@ -309,7 +309,7 @@
     </w:p>
     <w:p>
       <w:pPr>
-        <w:spacing w:line="480" w:lineRule="auto"/>
+        <w:spacing w:line="480" w:lineRule="auto" w:after="240"/>
         <w:ind w:firstLine="0"/>
       </w:pPr>
       <w:r>
@@ -323,7 +323,7 @@
     </w:p>
     <w:p>
       <w:pPr>
-        <w:spacing w:line="480" w:lineRule="auto"/>
+        <w:spacing w:line="480" w:lineRule="auto" w:after="240"/>
         <w:ind w:firstLine="0"/>
       </w:pPr>
       <w:r>
@@ -352,7 +352,7 @@
     </w:p>
     <w:p>
       <w:pPr>
-        <w:spacing w:line="480" w:lineRule="auto"/>
+        <w:spacing w:line="480" w:lineRule="auto" w:after="240"/>
         <w:ind w:firstLine="0"/>
       </w:pPr>
       <w:r>
@@ -366,7 +366,7 @@
     </w:p>
     <w:p>
       <w:pPr>
-        <w:spacing w:line="480" w:lineRule="auto"/>
+        <w:spacing w:line="480" w:lineRule="auto" w:after="240"/>
         <w:ind w:firstLine="0"/>
       </w:pPr>
       <w:r>
@@ -380,7 +380,7 @@
     </w:p>
     <w:p>
       <w:pPr>
-        <w:spacing w:line="480" w:lineRule="auto"/>
+        <w:spacing w:line="480" w:lineRule="auto" w:after="240"/>
         <w:ind w:firstLine="0"/>
       </w:pPr>
       <w:r>
@@ -409,7 +409,7 @@
     </w:p>
     <w:p>
       <w:pPr>
-        <w:spacing w:line="480" w:lineRule="auto"/>
+        <w:spacing w:line="480" w:lineRule="auto" w:after="240"/>
         <w:ind w:firstLine="0"/>
       </w:pPr>
       <w:r>
@@ -423,7 +423,7 @@
     </w:p>
     <w:p>
       <w:pPr>
-        <w:spacing w:line="480" w:lineRule="auto"/>
+        <w:spacing w:line="480" w:lineRule="auto" w:after="240"/>
         <w:ind w:firstLine="0"/>
       </w:pPr>
       <w:r>
@@ -437,7 +437,7 @@
     </w:p>
     <w:p>
       <w:pPr>
-        <w:spacing w:line="480" w:lineRule="auto"/>
+        <w:spacing w:line="480" w:lineRule="auto" w:after="240"/>
         <w:ind w:firstLine="0"/>
       </w:pPr>
       <w:r>
@@ -466,7 +466,7 @@
     </w:p>
     <w:p>
       <w:pPr>
-        <w:spacing w:line="480" w:lineRule="auto"/>
+        <w:spacing w:line="480" w:lineRule="auto" w:after="240"/>
         <w:ind w:firstLine="0"/>
       </w:pPr>
       <w:r>
@@ -519,7 +519,7 @@
     </w:p>
     <w:p>
       <w:pPr>
-        <w:spacing w:line="480" w:lineRule="auto"/>
+        <w:spacing w:line="480" w:lineRule="auto" w:after="240"/>
         <w:ind w:firstLine="0"/>
       </w:pPr>
       <w:r>
@@ -533,7 +533,7 @@
     </w:p>
     <w:p>
       <w:pPr>
-        <w:spacing w:line="480" w:lineRule="auto"/>
+        <w:spacing w:line="480" w:lineRule="auto" w:after="240"/>
         <w:ind w:firstLine="0"/>
       </w:pPr>
       <w:r>
@@ -547,7 +547,7 @@
     </w:p>
     <w:p>
       <w:pPr>
-        <w:spacing w:line="480" w:lineRule="auto"/>
+        <w:spacing w:line="480" w:lineRule="auto" w:after="240"/>
         <w:ind w:firstLine="0"/>
       </w:pPr>
       <w:r>
@@ -561,7 +561,7 @@
     </w:p>
     <w:p>
       <w:pPr>
-        <w:spacing w:line="480" w:lineRule="auto"/>
+        <w:spacing w:line="480" w:lineRule="auto" w:after="240"/>
         <w:ind w:firstLine="0"/>
       </w:pPr>
       <w:r>
@@ -575,7 +575,7 @@
     </w:p>
     <w:p>
       <w:pPr>
-        <w:spacing w:line="480" w:lineRule="auto"/>
+        <w:spacing w:line="480" w:lineRule="auto" w:after="240"/>
         <w:ind w:firstLine="0"/>
       </w:pPr>
       <w:r>
@@ -589,7 +589,7 @@
     </w:p>
     <w:p>
       <w:pPr>
-        <w:spacing w:line="480" w:lineRule="auto"/>
+        <w:spacing w:line="480" w:lineRule="auto" w:after="240"/>
         <w:ind w:firstLine="0"/>
       </w:pPr>
       <w:r>

</xml_diff>